<commit_message>
feat(laporan-bulanan): fix Mei2026 replacement, add dynamic BAB1 & BAB3 markers in template
</commit_message>
<xml_diff>
--- a/script-laporan-bulanan/template/laporan_template.docx
+++ b/script-laporan-bulanan/template/laporan_template.docx
@@ -1550,76 +1550,7 @@
         </w:rPr>
       </w:pPr>
       <w:r>
-        <w:rPr>
-          <w:rFonts w:ascii="Arial" w:hAnsi="Arial" w:cs="Arial"/>
-        </w:rPr>
-        <w:t xml:space="preserve">Pada bulan </w:t>
-      </w:r>
-      <w:r>
-        <w:rPr>
-          <w:rFonts w:ascii="Arial" w:hAnsi="Arial" w:cs="Arial"/>
-        </w:rPr>
-        <w:t>Mei</w:t>
-      </w:r>
-      <w:r>
-        <w:rPr>
-          <w:rFonts w:ascii="Arial" w:hAnsi="Arial" w:cs="Arial"/>
-        </w:rPr>
-        <w:t>2026</w:t>
-      </w:r>
-      <w:r>
-        <w:rPr>
-          <w:rFonts w:ascii="Arial" w:hAnsi="Arial" w:cs="Arial"/>
-        </w:rPr>
-        <w:t xml:space="preserve">, </w:t>
-      </w:r>
-      <w:r>
-        <w:rPr>
-          <w:rFonts w:ascii="Arial" w:hAnsi="Arial" w:cs="Arial"/>
-        </w:rPr>
-        <w:t>kami</w:t>
-      </w:r>
-      <w:r>
-        <w:rPr>
-          <w:rFonts w:ascii="Arial" w:hAnsi="Arial" w:cs="Arial"/>
-        </w:rPr>
-        <w:t xml:space="preserve"> telah mencapai sejumlah pencapaian penting. </w:t>
-      </w:r>
-      <w:r>
-        <w:rPr>
-          <w:rFonts w:ascii="Arial" w:hAnsi="Arial" w:cs="Arial"/>
-        </w:rPr>
-        <w:t>Kami</w:t>
-      </w:r>
-      <w:r>
-        <w:rPr>
-          <w:rFonts w:ascii="Arial" w:hAnsi="Arial" w:cs="Arial"/>
-        </w:rPr>
-        <w:t xml:space="preserve"> berhasil menyelesaikan tahap integrasi antara komponen backend dengan frontend </w:t>
-      </w:r>
-      <w:r>
-        <w:rPr>
-          <w:rFonts w:ascii="Arial" w:hAnsi="Arial" w:cs="Arial"/>
-        </w:rPr>
-        <w:t>platform pengawasan</w:t>
-      </w:r>
-      <w:r>
-        <w:rPr>
-          <w:rFonts w:ascii="Arial" w:hAnsi="Arial" w:cs="Arial"/>
-        </w:rPr>
-        <w:t xml:space="preserve">, memastikan keselarasan dan kinerja yang optimal dalam sistem. </w:t>
-      </w:r>
-      <w:r>
-        <w:rPr>
-          <w:rFonts w:ascii="Arial" w:hAnsi="Arial" w:cs="Arial"/>
-        </w:rPr>
-        <w:t>Kami</w:t>
-      </w:r>
-      <w:r>
-        <w:rPr>
-          <w:rFonts w:ascii="Arial" w:hAnsi="Arial" w:cs="Arial"/>
-        </w:rPr>
-        <w:t xml:space="preserve"> juga telah berhasil mengimplementasikan fitur keamanan yang kuat, seperti penggunaan protokol enkripsi untuk melindungi integritas dan kerahasiaan data pengguna.</w:t>
+        <w:t>{{ BAB1_PENCAPAIAN }}</w:t>
       </w:r>
     </w:p>
     <w:p>
@@ -1640,83 +1571,7 @@
         </w:rPr>
       </w:pPr>
       <w:r>
-        <w:rPr>
-          <w:rFonts w:ascii="Arial" w:hAnsi="Arial" w:cs="Arial"/>
-        </w:rPr>
-        <w:t xml:space="preserve">Selama </w:t>
-      </w:r>
-      <w:r>
-        <w:rPr>
-          <w:rFonts w:ascii="Arial" w:hAnsi="Arial" w:cs="Arial"/>
-        </w:rPr>
-        <w:t>penyusunan</w:t>
-      </w:r>
-      <w:r>
-        <w:rPr>
-          <w:rFonts w:ascii="Arial" w:hAnsi="Arial" w:cs="Arial"/>
-        </w:rPr>
-        <w:t xml:space="preserve">, </w:t>
-      </w:r>
-      <w:r>
-        <w:rPr>
-          <w:rFonts w:ascii="Arial" w:hAnsi="Arial" w:cs="Arial"/>
-        </w:rPr>
-        <w:t>kami</w:t>
-      </w:r>
-      <w:r>
-        <w:rPr>
-          <w:rFonts w:ascii="Arial" w:hAnsi="Arial" w:cs="Arial"/>
-        </w:rPr>
-        <w:t xml:space="preserve"> juga dihadapkan pada beberapa tantangan teknis, seperti penyesuaian dengan lingkungan infrastruktur yang ada dan pengelolaan data yang besar dan kompleks. Namun, </w:t>
-      </w:r>
-      <w:r>
-        <w:rPr>
-          <w:rFonts w:ascii="Arial" w:hAnsi="Arial" w:cs="Arial"/>
-        </w:rPr>
-        <w:t>kami</w:t>
-      </w:r>
-      <w:r>
-        <w:rPr>
-          <w:rFonts w:ascii="Arial" w:hAnsi="Arial" w:cs="Arial"/>
-        </w:rPr>
-        <w:t xml:space="preserve"> telah mengambil langkah-langkah yang strategis dan menerapkan solusi yang tepat untuk mengatasi </w:t>
-      </w:r>
-      <w:r>
-        <w:rPr>
-          <w:rFonts w:ascii="Arial" w:hAnsi="Arial" w:cs="Arial"/>
-        </w:rPr>
-        <w:t>tantangan teknis</w:t>
-      </w:r>
-      <w:r>
-        <w:rPr>
-          <w:rFonts w:ascii="Arial" w:hAnsi="Arial" w:cs="Arial"/>
-        </w:rPr>
-        <w:t xml:space="preserve"> tersebut. Dengan semangat kerjasama dan kolaborasi tim yang kuat, </w:t>
-      </w:r>
-      <w:r>
-        <w:rPr>
-          <w:rFonts w:ascii="Arial" w:hAnsi="Arial" w:cs="Arial"/>
-        </w:rPr>
-        <w:lastRenderedPageBreak/>
-        <w:t>kami</w:t>
-      </w:r>
-      <w:r>
-        <w:rPr>
-          <w:rFonts w:ascii="Arial" w:hAnsi="Arial" w:cs="Arial"/>
-        </w:rPr>
-        <w:t xml:space="preserve"> berhasil mengatasi kendala tersebut dan terus berupaya meningkatkan kualitas dan kehandalan sistem. </w:t>
-      </w:r>
-      <w:r>
-        <w:rPr>
-          <w:rFonts w:ascii="Arial" w:hAnsi="Arial" w:cs="Arial"/>
-        </w:rPr>
-        <w:t>Kami</w:t>
-      </w:r>
-      <w:r>
-        <w:rPr>
-          <w:rFonts w:ascii="Arial" w:hAnsi="Arial" w:cs="Arial"/>
-        </w:rPr>
-        <w:t xml:space="preserve"> ingin menyampaikan apresiasi kepada seluruh anggota tim yang telah berdedikasi dan bekerja keras untuk mencapai pencapaian ini.</w:t>
+        <w:t>{{ BAB1_TANTANGAN }}</w:t>
       </w:r>
     </w:p>
     <w:p>
@@ -2798,33 +2653,7 @@
         </w:rPr>
       </w:pPr>
       <w:r>
-        <w:rPr>
-          <w:rFonts w:ascii="Arial" w:hAnsi="Arial" w:cs="Arial"/>
-          <w:bCs/>
-        </w:rPr>
-        <w:t>Modul Tanya Data</w:t>
-      </w:r>
-    </w:p>
-    <w:p>
-      <w:pPr>
-        <w:pStyle w:val="ListParagraph"/>
-        <w:numPr>
-          <w:ilvl w:val="0"/>
-          <w:numId w:val="5"/>
-        </w:numPr>
-        <w:spacing w:line="360" w:lineRule="auto"/>
-        <w:jc w:val="both"/>
-        <w:rPr>
-          <w:rFonts w:ascii="Arial" w:hAnsi="Arial" w:cs="Arial"/>
-          <w:bCs/>
-        </w:rPr>
-      </w:pPr>
-      <w:r>
-        <w:rPr>
-          <w:rFonts w:ascii="Arial" w:hAnsi="Arial" w:cs="Arial"/>
-          <w:bCs/>
-        </w:rPr>
-        <w:t>Modul Sadar Gakum</w:t>
+        <w:t>{{ BAB3_KESIMPULAN }}</w:t>
       </w:r>
     </w:p>
     <w:p>

</xml_diff>